<commit_message>
Update portfolio from latest resumes: AZ-900 cert, 30% alert reduction bullet, education section, email contact, SRE resume download, UST title fix
</commit_message>
<xml_diff>
--- a/Nikhil_Raj_Resume.docx
+++ b/Nikhil_Raj_Resume.docx
@@ -31,7 +31,7 @@
           <w:sz w:val="24"/>
           <w:szCs w:val="24"/>
         </w:rPr>
-        <w:t xml:space="preserve">Senior DevOps / SRE Engineer</w:t>
+        <w:t xml:space="preserve">Senior DevOps Engineer</w:t>
       </w:r>
     </w:p>
     <w:p>
@@ -94,7 +94,7 @@
           <w:sz w:val="20"/>
           <w:szCs w:val="20"/>
         </w:rPr>
-        <w:t xml:space="preserve">Results-driven Senior DevOps / SRE Engineer with 8+ years of experience designing and managing scalable CI/CD pipelines, cloud infrastructure, and containerized workloads across Azure, GCP, and AWS. Proven track record in AIOps, cloud migrations (On-Prem to GCP, Azure to GCP), infrastructure-as-code, and SRE incident management. Certified Azure Administrator (AZ-104) skilled in Kubernetes, Terraform, Jenkins, ArgoCD, Ansible, and full-stack monitoring.</w:t>
+        <w:t xml:space="preserve">Results-driven Senior DevOps Engineer with 8+ years of experience designing scalable CI/CD pipelines, cloud-native infrastructure, and deployment automation across Azure, GCP, and AWS. Proven track record in cloud migrations, IaC, containerisation, and cost optimisation — including ~20% reduction in non-prod cloud spend and deployment downtime cut to 3 minutes. Certified Azure Administrator (AZ-104) skilled in Kubernetes, Terraform, Jenkins, ArgoCD, Ansible, and full-stack monitoring.</w:t>
       </w:r>
     </w:p>
     <w:p>
@@ -154,7 +154,7 @@
           <w:sz w:val="20"/>
           <w:szCs w:val="20"/>
         </w:rPr>
-        <w:t xml:space="preserve">Containerization &amp; Orchestration: </w:t>
+        <w:t xml:space="preserve">Containerisation &amp; Orchestration: </w:t>
       </w:r>
       <w:r>
         <w:rPr>
@@ -263,7 +263,7 @@
           <w:sz w:val="20"/>
           <w:szCs w:val="20"/>
         </w:rPr>
-        <w:t xml:space="preserve">Prometheus, Grafana, DataDog, Elasticsearch, Kibana, Humio, New Relic, PagerDuty</w:t>
+        <w:t xml:space="preserve">Prometheus, Grafana, Datadog, Elasticsearch, Kibana, Humio, New Relic, PagerDuty</w:t>
       </w:r>
     </w:p>
     <w:p>
@@ -503,6 +503,120 @@
           <w:sz w:val="20"/>
           <w:szCs w:val="20"/>
         </w:rPr>
+        <w:t xml:space="preserve">Managed Dev, Beta, and Production build pipelines using Jenkins and automated weekly deployments via ArgoCD in the Kubernetes Rancher environment, ensuring consistent and reliable release cadence.</w:t>
+      </w:r>
+    </w:p>
+    <w:p>
+      <w:pPr>
+        <w:pStyle w:val="ListParagraph"/>
+        <w:numPr>
+          <w:ilvl w:val="0"/>
+          <w:numId w:val="2"/>
+        </w:numPr>
+        <w:spacing w:after="40" w:before="40"/>
+      </w:pPr>
+      <w:r>
+        <w:rPr>
+          <w:rFonts w:ascii="Arial" w:cs="Arial" w:eastAsia="Arial" w:hAnsi="Arial"/>
+          <w:color w:val="222222"/>
+          <w:sz w:val="20"/>
+          <w:szCs w:val="20"/>
+        </w:rPr>
+        <w:t xml:space="preserve">Administered Kubernetes clusters end-to-end across 50+ nodes (1TB RAM and 126 CPUs per node) on Rancher — equivalent to 6,300+ total CPU cores running production AIOps workloads — managing namespace isolation, RBAC policies, resource quotas, and network policies to enforce security and multi-tenancy.</w:t>
+      </w:r>
+    </w:p>
+    <w:p>
+      <w:pPr>
+        <w:pStyle w:val="ListParagraph"/>
+        <w:numPr>
+          <w:ilvl w:val="0"/>
+          <w:numId w:val="2"/>
+        </w:numPr>
+        <w:spacing w:after="40" w:before="40"/>
+      </w:pPr>
+      <w:r>
+        <w:rPr>
+          <w:rFonts w:ascii="Arial" w:cs="Arial" w:eastAsia="Arial" w:hAnsi="Arial"/>
+          <w:color w:val="222222"/>
+          <w:sz w:val="20"/>
+          <w:szCs w:val="20"/>
+        </w:rPr>
+        <w:t xml:space="preserve">Authored and maintained Kubernetes manifests and Kustomization overlays for environment-specific (Dev/Beta/Prod) configuration management without code duplication.</w:t>
+      </w:r>
+    </w:p>
+    <w:p>
+      <w:pPr>
+        <w:pStyle w:val="ListParagraph"/>
+        <w:numPr>
+          <w:ilvl w:val="0"/>
+          <w:numId w:val="2"/>
+        </w:numPr>
+        <w:spacing w:after="40" w:before="40"/>
+      </w:pPr>
+      <w:r>
+        <w:rPr>
+          <w:rFonts w:ascii="Arial" w:cs="Arial" w:eastAsia="Arial" w:hAnsi="Arial"/>
+          <w:color w:val="222222"/>
+          <w:sz w:val="20"/>
+          <w:szCs w:val="20"/>
+        </w:rPr>
+        <w:t xml:space="preserve">Diagnosed and resolved Kubernetes pod failures, CrashLoopBackOff errors, OOMKilled events, and node resource pressure issues to maintain platform stability.</w:t>
+      </w:r>
+    </w:p>
+    <w:p>
+      <w:pPr>
+        <w:pStyle w:val="ListParagraph"/>
+        <w:numPr>
+          <w:ilvl w:val="0"/>
+          <w:numId w:val="2"/>
+        </w:numPr>
+        <w:spacing w:after="40" w:before="40"/>
+      </w:pPr>
+      <w:r>
+        <w:rPr>
+          <w:rFonts w:ascii="Arial" w:cs="Arial" w:eastAsia="Arial" w:hAnsi="Arial"/>
+          <w:color w:val="222222"/>
+          <w:sz w:val="20"/>
+          <w:szCs w:val="20"/>
+        </w:rPr>
+        <w:t xml:space="preserve">Monitored Kubernetes workloads using Prometheus and Grafana dashboards; configured HPA (Horizontal Pod Autoscaler) rules to handle traffic spikes automatically.</w:t>
+      </w:r>
+    </w:p>
+    <w:p>
+      <w:pPr>
+        <w:pStyle w:val="ListParagraph"/>
+        <w:numPr>
+          <w:ilvl w:val="0"/>
+          <w:numId w:val="2"/>
+        </w:numPr>
+        <w:spacing w:after="40" w:before="40"/>
+      </w:pPr>
+      <w:r>
+        <w:rPr>
+          <w:rFonts w:ascii="Arial" w:cs="Arial" w:eastAsia="Arial" w:hAnsi="Arial"/>
+          <w:color w:val="222222"/>
+          <w:sz w:val="20"/>
+          <w:szCs w:val="20"/>
+        </w:rPr>
+        <w:t xml:space="preserve">Leveraged AI tools (GitHub Copilot, Claude Code) to develop a Python script to fetch HPE Nimble array and datastore/volume utilization metrics, ingested the data into Prometheus via custom exporters, and built dedicated Grafana dashboards for real-time infrastructure visibility.</w:t>
+      </w:r>
+    </w:p>
+    <w:p>
+      <w:pPr>
+        <w:pStyle w:val="ListParagraph"/>
+        <w:numPr>
+          <w:ilvl w:val="0"/>
+          <w:numId w:val="2"/>
+        </w:numPr>
+        <w:spacing w:after="40" w:before="40"/>
+      </w:pPr>
+      <w:r>
+        <w:rPr>
+          <w:rFonts w:ascii="Arial" w:cs="Arial" w:eastAsia="Arial" w:hAnsi="Arial"/>
+          <w:color w:val="222222"/>
+          <w:sz w:val="20"/>
+          <w:szCs w:val="20"/>
+        </w:rPr>
         <w:t xml:space="preserve">Led VMware ESXi farm migration, transitioning data and servers to the new ESXi infrastructure with zero data loss.</w:t>
       </w:r>
     </w:p>
@@ -522,120 +636,6 @@
           <w:sz w:val="20"/>
           <w:szCs w:val="20"/>
         </w:rPr>
-        <w:t xml:space="preserve">Managed Dev, Beta, and Production build pipelines using Jenkins and automated weekly deployments via ArgoCD in the Kubernetes Rancher environment, ensuring consistent and reliable release cadence.</w:t>
-      </w:r>
-    </w:p>
-    <w:p>
-      <w:pPr>
-        <w:pStyle w:val="ListParagraph"/>
-        <w:numPr>
-          <w:ilvl w:val="0"/>
-          <w:numId w:val="2"/>
-        </w:numPr>
-        <w:spacing w:after="40" w:before="40"/>
-      </w:pPr>
-      <w:r>
-        <w:rPr>
-          <w:rFonts w:ascii="Arial" w:cs="Arial" w:eastAsia="Arial" w:hAnsi="Arial"/>
-          <w:color w:val="222222"/>
-          <w:sz w:val="20"/>
-          <w:szCs w:val="20"/>
-        </w:rPr>
-        <w:t xml:space="preserve">Administered Kubernetes clusters end-to-end across 50+ nodes (1TB RAM and 126 CPUs per node) on Rancher — equivalent to 6,300+ total CPU cores running production AIOps workloads — managing namespace isolation, RBAC policies, resource quotas, and network policies to enforce security and multi-tenancy.</w:t>
-      </w:r>
-    </w:p>
-    <w:p>
-      <w:pPr>
-        <w:pStyle w:val="ListParagraph"/>
-        <w:numPr>
-          <w:ilvl w:val="0"/>
-          <w:numId w:val="2"/>
-        </w:numPr>
-        <w:spacing w:after="40" w:before="40"/>
-      </w:pPr>
-      <w:r>
-        <w:rPr>
-          <w:rFonts w:ascii="Arial" w:cs="Arial" w:eastAsia="Arial" w:hAnsi="Arial"/>
-          <w:color w:val="222222"/>
-          <w:sz w:val="20"/>
-          <w:szCs w:val="20"/>
-        </w:rPr>
-        <w:t xml:space="preserve">Authored and maintained Kubernetes manifests and Kustomization overlays for environment-specific (Dev/Beta/Prod) configuration management without code duplication.</w:t>
-      </w:r>
-    </w:p>
-    <w:p>
-      <w:pPr>
-        <w:pStyle w:val="ListParagraph"/>
-        <w:numPr>
-          <w:ilvl w:val="0"/>
-          <w:numId w:val="2"/>
-        </w:numPr>
-        <w:spacing w:after="40" w:before="40"/>
-      </w:pPr>
-      <w:r>
-        <w:rPr>
-          <w:rFonts w:ascii="Arial" w:cs="Arial" w:eastAsia="Arial" w:hAnsi="Arial"/>
-          <w:color w:val="222222"/>
-          <w:sz w:val="20"/>
-          <w:szCs w:val="20"/>
-        </w:rPr>
-        <w:t xml:space="preserve">Diagnosed and resolved Kubernetes pod failures, CrashLoopBackOff errors, OOMKilled events, and node resource pressure issues to maintain platform stability.</w:t>
-      </w:r>
-    </w:p>
-    <w:p>
-      <w:pPr>
-        <w:pStyle w:val="ListParagraph"/>
-        <w:numPr>
-          <w:ilvl w:val="0"/>
-          <w:numId w:val="2"/>
-        </w:numPr>
-        <w:spacing w:after="40" w:before="40"/>
-      </w:pPr>
-      <w:r>
-        <w:rPr>
-          <w:rFonts w:ascii="Arial" w:cs="Arial" w:eastAsia="Arial" w:hAnsi="Arial"/>
-          <w:color w:val="222222"/>
-          <w:sz w:val="20"/>
-          <w:szCs w:val="20"/>
-        </w:rPr>
-        <w:t xml:space="preserve">Monitored Kubernetes workloads using Prometheus and Grafana dashboards; configured HPA (Horizontal Pod Autoscaler) rules to handle traffic spikes automatically.</w:t>
-      </w:r>
-    </w:p>
-    <w:p>
-      <w:pPr>
-        <w:pStyle w:val="ListParagraph"/>
-        <w:numPr>
-          <w:ilvl w:val="0"/>
-          <w:numId w:val="2"/>
-        </w:numPr>
-        <w:spacing w:after="40" w:before="40"/>
-      </w:pPr>
-      <w:r>
-        <w:rPr>
-          <w:rFonts w:ascii="Arial" w:cs="Arial" w:eastAsia="Arial" w:hAnsi="Arial"/>
-          <w:color w:val="222222"/>
-          <w:sz w:val="20"/>
-          <w:szCs w:val="20"/>
-        </w:rPr>
-        <w:t xml:space="preserve">Leveraged AI tools (GitHub Copilot, Claude Code) to develop a Python script to fetch HPE Nimble array and datastore/volume utilization metrics, ingested the data into Prometheus via custom exporters, and built dedicated Grafana dashboards for real-time infrastructure visibility.</w:t>
-      </w:r>
-    </w:p>
-    <w:p>
-      <w:pPr>
-        <w:pStyle w:val="ListParagraph"/>
-        <w:numPr>
-          <w:ilvl w:val="0"/>
-          <w:numId w:val="2"/>
-        </w:numPr>
-        <w:spacing w:after="40" w:before="40"/>
-      </w:pPr>
-      <w:r>
-        <w:rPr>
-          <w:rFonts w:ascii="Arial" w:cs="Arial" w:eastAsia="Arial" w:hAnsi="Arial"/>
-          <w:color w:val="222222"/>
-          <w:sz w:val="20"/>
-          <w:szCs w:val="20"/>
-        </w:rPr>
         <w:t xml:space="preserve">Executed RHEL OS upgrades from version 6 to 7 across production servers, ensuring minimal downtime.</w:t>
       </w:r>
     </w:p>
@@ -656,6 +656,25 @@
           <w:szCs w:val="20"/>
         </w:rPr>
         <w:t xml:space="preserve">Monitored production systems using Prometheus, Grafana, and Humio; responded to PagerDuty alerts with an average incident resolution time of 15–30 minutes, maintaining strong SLA compliance.</w:t>
+      </w:r>
+    </w:p>
+    <w:p>
+      <w:pPr>
+        <w:pStyle w:val="ListParagraph"/>
+        <w:numPr>
+          <w:ilvl w:val="0"/>
+          <w:numId w:val="2"/>
+        </w:numPr>
+        <w:spacing w:after="40" w:before="40"/>
+      </w:pPr>
+      <w:r>
+        <w:rPr>
+          <w:rFonts w:ascii="Arial" w:cs="Arial" w:eastAsia="Arial" w:hAnsi="Arial"/>
+          <w:color w:val="222222"/>
+          <w:sz w:val="20"/>
+          <w:szCs w:val="20"/>
+        </w:rPr>
+        <w:t xml:space="preserve">Reduced false PagerDuty alerts by 30% by auditing and refining Prometheus Alertmanager queries — improving alert fidelity, reducing on-call fatigue, and ensuring only actionable incidents triggered pages.</w:t>
       </w:r>
     </w:p>
     <w:p>
@@ -797,6 +816,63 @@
           <w:sz w:val="20"/>
           <w:szCs w:val="20"/>
         </w:rPr>
+        <w:t xml:space="preserve">Executed Azure-to-GCP cloud migration for the Marketplace project, minimizing service disruption.</w:t>
+      </w:r>
+    </w:p>
+    <w:p>
+      <w:pPr>
+        <w:pStyle w:val="ListParagraph"/>
+        <w:numPr>
+          <w:ilvl w:val="0"/>
+          <w:numId w:val="2"/>
+        </w:numPr>
+        <w:spacing w:after="40" w:before="40"/>
+      </w:pPr>
+      <w:r>
+        <w:rPr>
+          <w:rFonts w:ascii="Arial" w:cs="Arial" w:eastAsia="Arial" w:hAnsi="Arial"/>
+          <w:color w:val="222222"/>
+          <w:sz w:val="20"/>
+          <w:szCs w:val="20"/>
+        </w:rPr>
+        <w:t xml:space="preserve">Delivered On-Premises-to-GCP migration for the Loyalty project, re-architecting infrastructure for cloud-native scalability.</w:t>
+      </w:r>
+    </w:p>
+    <w:p>
+      <w:pPr>
+        <w:pStyle w:val="ListParagraph"/>
+        <w:numPr>
+          <w:ilvl w:val="0"/>
+          <w:numId w:val="2"/>
+        </w:numPr>
+        <w:spacing w:after="40" w:before="40"/>
+      </w:pPr>
+      <w:r>
+        <w:rPr>
+          <w:rFonts w:ascii="Arial" w:cs="Arial" w:eastAsia="Arial" w:hAnsi="Arial"/>
+          <w:color w:val="222222"/>
+          <w:sz w:val="20"/>
+          <w:szCs w:val="20"/>
+        </w:rPr>
+        <w:t xml:space="preserve">Managed and maintained environment provisioning and deployments using Terraform and Azure DevOps pipelines.</w:t>
+      </w:r>
+    </w:p>
+    <w:p>
+      <w:pPr>
+        <w:pStyle w:val="ListParagraph"/>
+        <w:numPr>
+          <w:ilvl w:val="0"/>
+          <w:numId w:val="2"/>
+        </w:numPr>
+        <w:spacing w:after="40" w:before="40"/>
+      </w:pPr>
+      <w:r>
+        <w:rPr>
+          <w:rFonts w:ascii="Arial" w:cs="Arial" w:eastAsia="Arial" w:hAnsi="Arial"/>
+          <w:color w:val="222222"/>
+          <w:sz w:val="20"/>
+          <w:szCs w:val="20"/>
+        </w:rPr>
         <w:t xml:space="preserve">Collaborated with Dev and QA teams to troubleshoot container and Kubernetes pod issues across multiple environments (Dev, QA, UAT, Prod).</w:t>
       </w:r>
     </w:p>
@@ -816,45 +892,7 @@
           <w:sz w:val="20"/>
           <w:szCs w:val="20"/>
         </w:rPr>
-        <w:t xml:space="preserve">Executed Azure-to-GCP cloud migration for the Marketplace project, minimizing service disruption.</w:t>
-      </w:r>
-    </w:p>
-    <w:p>
-      <w:pPr>
-        <w:pStyle w:val="ListParagraph"/>
-        <w:numPr>
-          <w:ilvl w:val="0"/>
-          <w:numId w:val="2"/>
-        </w:numPr>
-        <w:spacing w:after="40" w:before="40"/>
-      </w:pPr>
-      <w:r>
-        <w:rPr>
-          <w:rFonts w:ascii="Arial" w:cs="Arial" w:eastAsia="Arial" w:hAnsi="Arial"/>
-          <w:color w:val="222222"/>
-          <w:sz w:val="20"/>
-          <w:szCs w:val="20"/>
-        </w:rPr>
-        <w:t xml:space="preserve">Delivered On-Premises-to-GCP migration for the Loyalty project, re-architecting infrastructure for cloud-native scalability.</w:t>
-      </w:r>
-    </w:p>
-    <w:p>
-      <w:pPr>
-        <w:pStyle w:val="ListParagraph"/>
-        <w:numPr>
-          <w:ilvl w:val="0"/>
-          <w:numId w:val="2"/>
-        </w:numPr>
-        <w:spacing w:after="40" w:before="40"/>
-      </w:pPr>
-      <w:r>
-        <w:rPr>
-          <w:rFonts w:ascii="Arial" w:cs="Arial" w:eastAsia="Arial" w:hAnsi="Arial"/>
-          <w:color w:val="222222"/>
-          <w:sz w:val="20"/>
-          <w:szCs w:val="20"/>
-        </w:rPr>
-        <w:t xml:space="preserve">Managed and maintained environment provisioning and deployments using Terraform and Azure DevOps pipelines.</w:t>
+        <w:t xml:space="preserve">Implemented monitoring, observability, and alerting for Bakkt platform services using Datadog — configured dashboards, APM traces, log pipelines, and alert policies to ensure real-time visibility into application health and infrastructure performance.</w:t>
       </w:r>
     </w:p>
     <w:p>
@@ -874,25 +912,6 @@
           <w:szCs w:val="20"/>
         </w:rPr>
         <w:t xml:space="preserve">Administered access control for Azure, FusionAuth, and database resources across development teams.</w:t>
-      </w:r>
-    </w:p>
-    <w:p>
-      <w:pPr>
-        <w:pStyle w:val="ListParagraph"/>
-        <w:numPr>
-          <w:ilvl w:val="0"/>
-          <w:numId w:val="2"/>
-        </w:numPr>
-        <w:spacing w:after="40" w:before="40"/>
-      </w:pPr>
-      <w:r>
-        <w:rPr>
-          <w:rFonts w:ascii="Arial" w:cs="Arial" w:eastAsia="Arial" w:hAnsi="Arial"/>
-          <w:color w:val="222222"/>
-          <w:sz w:val="20"/>
-          <w:szCs w:val="20"/>
-        </w:rPr>
-        <w:t xml:space="preserve">Implemented monitoring, observability, and alerting for Bakkt platform services using Datadog — configured dashboards, APM traces, log pipelines, and alert policies to ensure real-time visibility into application health and infrastructure performance.</w:t>
       </w:r>
     </w:p>
     <w:p>

</xml_diff>